<commit_message>
updated few section of the draft report
</commit_message>
<xml_diff>
--- a/CSN11131 Coursework (Tokenization).docx
+++ b/CSN11131 Coursework (Tokenization).docx
@@ -589,16 +589,6 @@
     </w:p>
     <w:p>
       <w:pPr>
-        <w:jc w:val="both"/>
-        <w:rPr>
-          <w:rFonts w:ascii="Arial" w:hAnsi="Arial" w:cs="Arial"/>
-          <w:sz w:val="22"/>
-          <w:szCs w:val="22"/>
-        </w:rPr>
-      </w:pPr>
-    </w:p>
-    <w:p>
-      <w:pPr>
         <w:pStyle w:val="ListParagraph"/>
         <w:numPr>
           <w:ilvl w:val="1"/>
@@ -621,6 +611,155 @@
           <w:sz w:val="22"/>
           <w:szCs w:val="22"/>
         </w:rPr>
+        <w:t>COMPARISON OF TOKENIZATION METHODS</w:t>
+      </w:r>
+    </w:p>
+    <w:p>
+      <w:pPr>
+        <w:jc w:val="both"/>
+        <w:rPr>
+          <w:rFonts w:ascii="Arial" w:hAnsi="Arial" w:cs="Arial"/>
+          <w:sz w:val="22"/>
+          <w:szCs w:val="22"/>
+        </w:rPr>
+      </w:pPr>
+      <w:r>
+        <w:rPr>
+          <w:rFonts w:ascii="Arial" w:hAnsi="Arial" w:cs="Arial"/>
+          <w:sz w:val="22"/>
+          <w:szCs w:val="22"/>
+        </w:rPr>
+        <w:t>One way to bring your tokenization implementation to life is by leveraging JSON Web Tokens (JWT), OAuth 2.0, or Fernet tokens - they are some of the most popular ones.</w:t>
+      </w:r>
+    </w:p>
+    <w:p>
+      <w:pPr>
+        <w:jc w:val="both"/>
+        <w:rPr>
+          <w:rFonts w:ascii="Arial" w:hAnsi="Arial" w:cs="Arial"/>
+          <w:sz w:val="22"/>
+          <w:szCs w:val="22"/>
+        </w:rPr>
+      </w:pPr>
+      <w:r>
+        <w:rPr>
+          <w:rFonts w:ascii="Arial" w:hAnsi="Arial" w:cs="Arial"/>
+          <w:sz w:val="22"/>
+          <w:szCs w:val="22"/>
+        </w:rPr>
+        <w:t>JWTs, or JSON Web Tokens, have become the standard for stateless authentication in web applications. These tokens embed user information, or claims, within themselves. This means a server can authenticate a user's request without looking up the session information, which is a plus for scalability and performance. They are especially great when working with RESTful APIs and distributed systems (Kumar and Patel, 2021).</w:t>
+      </w:r>
+    </w:p>
+    <w:p>
+      <w:pPr>
+        <w:jc w:val="both"/>
+        <w:rPr>
+          <w:rFonts w:ascii="Arial" w:hAnsi="Arial" w:cs="Arial"/>
+          <w:sz w:val="22"/>
+          <w:szCs w:val="22"/>
+        </w:rPr>
+      </w:pPr>
+      <w:r>
+        <w:rPr>
+          <w:rFonts w:ascii="Arial" w:hAnsi="Arial" w:cs="Arial"/>
+          <w:sz w:val="22"/>
+          <w:szCs w:val="22"/>
+        </w:rPr>
+        <w:t>OAuth 2.0 differs from the previous ones in that it is not a token format but an authorization framework. Essentially, it allows the user to give a third-party app a 'key' that only opens a part of their account, without handing over their password. While OAuth 2.0 is usually implemented using JWTs as access tokens, it also brings with it a series of complications such as authorization servers and different modes of communication (Hardt, 2020).</w:t>
+      </w:r>
+    </w:p>
+    <w:p>
+      <w:pPr>
+        <w:jc w:val="both"/>
+        <w:rPr>
+          <w:rFonts w:ascii="Arial" w:hAnsi="Arial" w:cs="Arial"/>
+          <w:sz w:val="22"/>
+          <w:szCs w:val="22"/>
+        </w:rPr>
+      </w:pPr>
+      <w:r>
+        <w:rPr>
+          <w:rFonts w:ascii="Arial" w:hAnsi="Arial" w:cs="Arial"/>
+          <w:sz w:val="22"/>
+          <w:szCs w:val="22"/>
+        </w:rPr>
+        <w:t xml:space="preserve">In contrast, Fernet tokens offer a much easier method derived from symmetric encryption. They not only guarantee that what is inside the token remains </w:t>
+      </w:r>
+      <w:r>
+        <w:rPr>
+          <w:rFonts w:ascii="Arial" w:hAnsi="Arial" w:cs="Arial"/>
+          <w:sz w:val="22"/>
+          <w:szCs w:val="22"/>
+        </w:rPr>
+        <w:t>secret,</w:t>
+      </w:r>
+      <w:r>
+        <w:rPr>
+          <w:rFonts w:ascii="Arial" w:hAnsi="Arial" w:cs="Arial"/>
+          <w:sz w:val="22"/>
+          <w:szCs w:val="22"/>
+        </w:rPr>
+        <w:t xml:space="preserve"> but they are also the least flexible since they don't have the capability of storing claims nor can they be easily integrated with web-based authentication systems.</w:t>
+      </w:r>
+    </w:p>
+    <w:p>
+      <w:pPr>
+        <w:jc w:val="both"/>
+        <w:rPr>
+          <w:rFonts w:ascii="Arial" w:hAnsi="Arial" w:cs="Arial"/>
+          <w:sz w:val="22"/>
+          <w:szCs w:val="22"/>
+        </w:rPr>
+      </w:pPr>
+      <w:r>
+        <w:rPr>
+          <w:rFonts w:ascii="Arial" w:hAnsi="Arial" w:cs="Arial"/>
+          <w:sz w:val="22"/>
+          <w:szCs w:val="22"/>
+        </w:rPr>
+        <w:t xml:space="preserve">At the end of the day, it is true that OAuth 2.0 fits better the need of big scale and third-party authorization scenarios, and that Fernet tokens provide strong encryption, but JWT is the one that offers a good compromise for building </w:t>
+      </w:r>
+      <w:r>
+        <w:rPr>
+          <w:rFonts w:ascii="Arial" w:hAnsi="Arial" w:cs="Arial"/>
+          <w:sz w:val="22"/>
+          <w:szCs w:val="22"/>
+        </w:rPr>
+        <w:t>lightweight</w:t>
+      </w:r>
+      <w:r>
+        <w:rPr>
+          <w:rFonts w:ascii="Arial" w:hAnsi="Arial" w:cs="Arial"/>
+          <w:sz w:val="22"/>
+          <w:szCs w:val="22"/>
+        </w:rPr>
+        <w:t>, scalable and stateless authentication systems. That's why JWT has been selected for this work's implementation.</w:t>
+      </w:r>
+    </w:p>
+    <w:p>
+      <w:pPr>
+        <w:pStyle w:val="ListParagraph"/>
+        <w:numPr>
+          <w:ilvl w:val="1"/>
+          <w:numId w:val="1"/>
+        </w:numPr>
+        <w:jc w:val="both"/>
+        <w:rPr>
+          <w:rFonts w:ascii="Arial" w:hAnsi="Arial" w:cs="Arial"/>
+          <w:b/>
+          <w:bCs/>
+          <w:sz w:val="22"/>
+          <w:szCs w:val="22"/>
+        </w:rPr>
+      </w:pPr>
+      <w:r>
+        <w:rPr>
+          <w:rFonts w:ascii="Arial" w:hAnsi="Arial" w:cs="Arial"/>
+          <w:b/>
+          <w:bCs/>
+          <w:sz w:val="22"/>
+          <w:szCs w:val="22"/>
+        </w:rPr>
         <w:t xml:space="preserve">EXAMPLES OF TOKENIZATION AND JWT APPLICATIONS </w:t>
       </w:r>
     </w:p>
@@ -683,6 +822,7 @@
           <w:sz w:val="22"/>
           <w:szCs w:val="22"/>
         </w:rPr>
+        <w:lastRenderedPageBreak/>
         <w:t xml:space="preserve">Healthcare professionals deal with the core of a person's identity, e.g. their name, social security number, and home address. Therefore, health care institutions must explore methods not only to safeguard patient confidentiality but also to conform to HIPAA standards when sharing information within the organization and with the outside world. Besides these unique personal identifiers, medical records and lab results are only a few examples of a patient's information that is highly vulnerable to be misused if not adequately protected. One effective method of safeguarding patient information is using tokenization. Therefore, medically related information as well as personal identifiers may be tokenized. This makes it possible for data sharing to be done in a secure manner, privacy to be protected, </w:t>
       </w:r>
       <w:r>
@@ -802,7 +942,6 @@
           <w:sz w:val="22"/>
           <w:szCs w:val="22"/>
         </w:rPr>
-        <w:lastRenderedPageBreak/>
         <w:t xml:space="preserve">IMPLIMENTATION </w:t>
       </w:r>
     </w:p>
@@ -993,6 +1132,26 @@
     <w:p>
       <w:pPr>
         <w:pStyle w:val="ListParagraph"/>
+        <w:rPr>
+          <w:rFonts w:ascii="Arial" w:hAnsi="Arial" w:cs="Arial"/>
+          <w:sz w:val="22"/>
+          <w:szCs w:val="22"/>
+        </w:rPr>
+      </w:pPr>
+    </w:p>
+    <w:p>
+      <w:pPr>
+        <w:pStyle w:val="ListParagraph"/>
+        <w:rPr>
+          <w:rFonts w:ascii="Arial" w:hAnsi="Arial" w:cs="Arial"/>
+          <w:sz w:val="22"/>
+          <w:szCs w:val="22"/>
+        </w:rPr>
+      </w:pPr>
+    </w:p>
+    <w:p>
+      <w:pPr>
+        <w:pStyle w:val="ListParagraph"/>
         <w:spacing w:after="0" w:line="240" w:lineRule="auto"/>
         <w:rPr>
           <w:rFonts w:ascii="Arial" w:eastAsia="Times New Roman" w:hAnsi="Arial" w:cs="Arial"/>
@@ -1016,6 +1175,7 @@
           <w:lang w:val="en-AE" w:eastAsia="en-AE"/>
           <w14:ligatures w14:val="none"/>
         </w:rPr>
+        <w:lastRenderedPageBreak/>
         <w:t xml:space="preserve">System </w:t>
       </w:r>
       <w:r>
@@ -1044,6 +1204,22 @@
         </w:rPr>
         <w:t>:</w:t>
       </w:r>
+    </w:p>
+    <w:p>
+      <w:pPr>
+        <w:pStyle w:val="ListParagraph"/>
+        <w:spacing w:after="0" w:line="240" w:lineRule="auto"/>
+        <w:rPr>
+          <w:rFonts w:ascii="Arial" w:eastAsia="Times New Roman" w:hAnsi="Arial" w:cs="Arial"/>
+          <w:b/>
+          <w:bCs/>
+          <w:kern w:val="0"/>
+          <w:sz w:val="22"/>
+          <w:szCs w:val="22"/>
+          <w:lang w:val="en-AE" w:eastAsia="en-AE"/>
+          <w14:ligatures w14:val="none"/>
+        </w:rPr>
+      </w:pPr>
     </w:p>
     <w:p>
       <w:pPr>
@@ -1342,6 +1518,8 @@
       <w:r>
         <w:rPr>
           <w:rFonts w:ascii="Arial" w:hAnsi="Arial" w:cs="Arial"/>
+          <w:b/>
+          <w:bCs/>
           <w:sz w:val="22"/>
           <w:szCs w:val="22"/>
         </w:rPr>
@@ -1381,10 +1559,20 @@
       <w:r>
         <w:rPr>
           <w:rFonts w:ascii="Arial" w:hAnsi="Arial" w:cs="Arial"/>
-          <w:sz w:val="22"/>
-          <w:szCs w:val="22"/>
-        </w:rPr>
-        <w:t>Token verification: Validates the token to ensure authenticity and integrity</w:t>
+          <w:b/>
+          <w:bCs/>
+          <w:sz w:val="22"/>
+          <w:szCs w:val="22"/>
+        </w:rPr>
+        <w:t>Token verification:</w:t>
+      </w:r>
+      <w:r>
+        <w:rPr>
+          <w:rFonts w:ascii="Arial" w:hAnsi="Arial" w:cs="Arial"/>
+          <w:sz w:val="22"/>
+          <w:szCs w:val="22"/>
+        </w:rPr>
+        <w:t xml:space="preserve"> Validates the token to ensure authenticity and integrity</w:t>
       </w:r>
     </w:p>
     <w:p>
@@ -1404,36 +1592,6 @@
         </w:rPr>
         <w:t>The token is digitally signed with the HS256 algorithm and a time-to-live to limit possible misuse of the token.</w:t>
       </w:r>
-    </w:p>
-    <w:p>
-      <w:pPr>
-        <w:jc w:val="both"/>
-        <w:rPr>
-          <w:rFonts w:ascii="Arial" w:hAnsi="Arial" w:cs="Arial"/>
-          <w:sz w:val="22"/>
-          <w:szCs w:val="22"/>
-        </w:rPr>
-      </w:pPr>
-    </w:p>
-    <w:p>
-      <w:pPr>
-        <w:jc w:val="both"/>
-        <w:rPr>
-          <w:rFonts w:ascii="Arial" w:hAnsi="Arial" w:cs="Arial"/>
-          <w:sz w:val="22"/>
-          <w:szCs w:val="22"/>
-        </w:rPr>
-      </w:pPr>
-    </w:p>
-    <w:p>
-      <w:pPr>
-        <w:jc w:val="both"/>
-        <w:rPr>
-          <w:rFonts w:ascii="Arial" w:hAnsi="Arial" w:cs="Arial"/>
-          <w:sz w:val="22"/>
-          <w:szCs w:val="22"/>
-        </w:rPr>
-      </w:pPr>
     </w:p>
     <w:p>
       <w:pPr>
@@ -1459,7 +1617,6 @@
           <w:sz w:val="22"/>
           <w:szCs w:val="22"/>
         </w:rPr>
-        <w:lastRenderedPageBreak/>
         <w:t xml:space="preserve">CODE IMPLEMENTATION </w:t>
       </w:r>
     </w:p>
@@ -3291,6 +3448,7 @@
           <w:lang w:val="en-AE" w:eastAsia="en-AE"/>
           <w14:ligatures w14:val="none"/>
         </w:rPr>
+        <w:lastRenderedPageBreak/>
         <w:t>@</w:t>
       </w:r>
       <w:proofErr w:type="gramStart"/>
@@ -6979,6 +7137,24 @@
         </w:rPr>
         <w:t>Token Generation:</w:t>
       </w:r>
+      <w:r>
+        <w:rPr>
+          <w:rFonts w:ascii="Arial" w:hAnsi="Arial" w:cs="Arial"/>
+          <w:b/>
+          <w:bCs/>
+          <w:sz w:val="22"/>
+          <w:szCs w:val="22"/>
+        </w:rPr>
+        <w:t xml:space="preserve"> </w:t>
+      </w:r>
+      <w:r>
+        <w:rPr>
+          <w:rFonts w:ascii="Arial" w:hAnsi="Arial" w:cs="Arial"/>
+          <w:sz w:val="22"/>
+          <w:szCs w:val="22"/>
+        </w:rPr>
+        <w:t>The token generation is illustrated in figure 1. The /login end point accepts requests in a POST format with valid credentials (in the JSON format), which the server authenticates and returns a JSON with a token that consists of the user id and the expiration of the token (in JSON format) that will have to be passed to all the subsequent requests to the protected services</w:t>
+      </w:r>
     </w:p>
     <w:p>
       <w:pPr>
@@ -6989,20 +7165,34 @@
           <w:szCs w:val="22"/>
         </w:rPr>
       </w:pPr>
-      <w:r>
-        <w:rPr>
-          <w:rFonts w:ascii="Arial" w:hAnsi="Arial" w:cs="Arial"/>
-          <w:sz w:val="22"/>
-          <w:szCs w:val="22"/>
-        </w:rPr>
+    </w:p>
+    <w:p>
+      <w:pPr>
+        <w:jc w:val="center"/>
+        <w:rPr>
+          <w:rFonts w:ascii="Arial" w:hAnsi="Arial" w:cs="Arial"/>
+          <w:b/>
+          <w:bCs/>
+          <w:sz w:val="22"/>
+          <w:szCs w:val="22"/>
+        </w:rPr>
+      </w:pPr>
+      <w:r>
+        <w:rPr>
+          <w:rFonts w:ascii="Arial" w:hAnsi="Arial" w:cs="Arial"/>
+          <w:noProof/>
+          <w:sz w:val="22"/>
+          <w:szCs w:val="22"/>
+        </w:rPr>
+        <w:lastRenderedPageBreak/>
         <w:drawing>
-          <wp:anchor distT="0" distB="0" distL="114300" distR="114300" simplePos="0" relativeHeight="251661312" behindDoc="0" locked="0" layoutInCell="1" allowOverlap="1" wp14:anchorId="69C4C0F6" wp14:editId="5DB075F3">
+          <wp:anchor distT="0" distB="0" distL="114300" distR="114300" simplePos="0" relativeHeight="251661312" behindDoc="0" locked="0" layoutInCell="1" allowOverlap="1" wp14:anchorId="69C4C0F6" wp14:editId="79EDEACC">
             <wp:simplePos x="0" y="0"/>
             <wp:positionH relativeFrom="margin">
               <wp:align>left</wp:align>
             </wp:positionH>
             <wp:positionV relativeFrom="paragraph">
-              <wp:posOffset>777240</wp:posOffset>
+              <wp:posOffset>1905</wp:posOffset>
             </wp:positionV>
             <wp:extent cx="5731510" cy="3577590"/>
             <wp:effectExtent l="0" t="0" r="2540" b="3810"/>
@@ -7042,45 +7232,13 @@
       <w:r>
         <w:rPr>
           <w:rFonts w:ascii="Arial" w:hAnsi="Arial" w:cs="Arial"/>
-          <w:sz w:val="22"/>
-          <w:szCs w:val="22"/>
-        </w:rPr>
-        <w:t>The token generation is illustrated in figure 1. The /login end point accepts requests in a POST format with valid credentials (in the JSON format), which the server authenticates and returns a JSON with a token that consists of the user id and the expiration of the token (in JSON format) that will have to be passed to all the subsequent requests to the protected services.</w:t>
-      </w:r>
-    </w:p>
-    <w:p>
-      <w:pPr>
-        <w:jc w:val="center"/>
-        <w:rPr>
-          <w:rFonts w:ascii="Arial" w:hAnsi="Arial" w:cs="Arial"/>
           <w:b/>
           <w:bCs/>
           <w:sz w:val="22"/>
           <w:szCs w:val="22"/>
         </w:rPr>
-      </w:pPr>
-      <w:r>
-        <w:rPr>
-          <w:rFonts w:ascii="Arial" w:hAnsi="Arial" w:cs="Arial"/>
-          <w:b/>
-          <w:bCs/>
-          <w:sz w:val="22"/>
-          <w:szCs w:val="22"/>
-        </w:rPr>
         <w:t>Figure 1: Token Generation with /login endpoint</w:t>
       </w:r>
-    </w:p>
-    <w:p>
-      <w:pPr>
-        <w:jc w:val="center"/>
-        <w:rPr>
-          <w:rFonts w:ascii="Arial" w:hAnsi="Arial" w:cs="Arial"/>
-          <w:b/>
-          <w:bCs/>
-          <w:sz w:val="22"/>
-          <w:szCs w:val="22"/>
-        </w:rPr>
-      </w:pPr>
     </w:p>
     <w:p>
       <w:pPr>
@@ -7110,47 +7268,16 @@
       </w:pPr>
       <w:r>
         <w:rPr>
-          <w:rFonts w:ascii="Arial" w:hAnsi="Arial" w:cs="Arial"/>
-          <w:b/>
-          <w:bCs/>
-          <w:sz w:val="22"/>
-          <w:szCs w:val="22"/>
-        </w:rPr>
-        <w:lastRenderedPageBreak/>
-        <w:t>Protected Endpoint access</w:t>
-      </w:r>
-      <w:r>
-        <w:rPr>
-          <w:rFonts w:ascii="Arial" w:hAnsi="Arial" w:cs="Arial"/>
-          <w:sz w:val="22"/>
-          <w:szCs w:val="22"/>
-        </w:rPr>
-        <w:t>:</w:t>
-      </w:r>
-    </w:p>
-    <w:p>
-      <w:pPr>
-        <w:jc w:val="both"/>
-        <w:rPr>
-          <w:rFonts w:ascii="Arial" w:hAnsi="Arial" w:cs="Arial"/>
-          <w:sz w:val="22"/>
-          <w:szCs w:val="22"/>
-        </w:rPr>
-      </w:pPr>
-      <w:r>
-        <w:rPr>
-          <w:rFonts w:ascii="Arial" w:hAnsi="Arial" w:cs="Arial"/>
-          <w:sz w:val="22"/>
-          <w:szCs w:val="22"/>
+          <w:noProof/>
         </w:rPr>
         <w:drawing>
-          <wp:anchor distT="0" distB="0" distL="114300" distR="114300" simplePos="0" relativeHeight="251663360" behindDoc="0" locked="0" layoutInCell="1" allowOverlap="1" wp14:anchorId="50EF7E6E" wp14:editId="4CA7FFBD">
+          <wp:anchor distT="0" distB="0" distL="114300" distR="114300" simplePos="0" relativeHeight="251663360" behindDoc="0" locked="0" layoutInCell="1" allowOverlap="1" wp14:anchorId="50EF7E6E" wp14:editId="7F0CCA50">
             <wp:simplePos x="0" y="0"/>
             <wp:positionH relativeFrom="margin">
               <wp:align>left</wp:align>
             </wp:positionH>
             <wp:positionV relativeFrom="paragraph">
-              <wp:posOffset>822325</wp:posOffset>
+              <wp:posOffset>1059815</wp:posOffset>
             </wp:positionV>
             <wp:extent cx="5731510" cy="3048000"/>
             <wp:effectExtent l="0" t="0" r="2540" b="0"/>
@@ -7193,24 +7320,52 @@
       <w:r>
         <w:rPr>
           <w:rFonts w:ascii="Arial" w:hAnsi="Arial" w:cs="Arial"/>
-          <w:sz w:val="22"/>
-          <w:szCs w:val="22"/>
-        </w:rPr>
-        <w:t>A request was sent to the protected end point with a token in the Authorization header which contains the token that was received in the previous step. The server acknowledges the token and grants the user access to the resource that will return the decoded user identity, the result can be seen in figure 2 below:</w:t>
-      </w:r>
-    </w:p>
-    <w:p>
-      <w:pPr>
-        <w:jc w:val="center"/>
-        <w:rPr>
-          <w:rFonts w:ascii="Arial" w:hAnsi="Arial" w:cs="Arial"/>
           <w:b/>
           <w:bCs/>
           <w:sz w:val="22"/>
           <w:szCs w:val="22"/>
         </w:rPr>
-      </w:pPr>
-      <w:r>
+        <w:t>Protected Endpoint access</w:t>
+      </w:r>
+      <w:r>
+        <w:rPr>
+          <w:rFonts w:ascii="Arial" w:hAnsi="Arial" w:cs="Arial"/>
+          <w:sz w:val="22"/>
+          <w:szCs w:val="22"/>
+        </w:rPr>
+        <w:t>:</w:t>
+      </w:r>
+      <w:r>
+        <w:rPr>
+          <w:rFonts w:ascii="Arial" w:hAnsi="Arial" w:cs="Arial"/>
+          <w:sz w:val="22"/>
+          <w:szCs w:val="22"/>
+        </w:rPr>
+        <w:t xml:space="preserve"> </w:t>
+      </w:r>
+      <w:r>
+        <w:rPr>
+          <w:rFonts w:ascii="Arial" w:hAnsi="Arial" w:cs="Arial"/>
+          <w:sz w:val="22"/>
+          <w:szCs w:val="22"/>
+        </w:rPr>
+        <w:t>A request was sent to the protected end point with a token in the Authorization header which contains the token that was received in the previous step. The server acknowledges the token and grants the user access to the resource that will return the decoded user identity, the result can be seen in figure 2 below:</w:t>
+      </w:r>
+    </w:p>
+    <w:p>
+      <w:pPr>
+        <w:pStyle w:val="ListParagraph"/>
+        <w:jc w:val="both"/>
+        <w:rPr>
+          <w:rFonts w:ascii="Arial" w:hAnsi="Arial" w:cs="Arial"/>
+          <w:sz w:val="22"/>
+          <w:szCs w:val="22"/>
+        </w:rPr>
+      </w:pPr>
+    </w:p>
+    <w:p>
+      <w:pPr>
+        <w:jc w:val="center"/>
         <w:rPr>
           <w:rFonts w:ascii="Arial" w:hAnsi="Arial" w:cs="Arial"/>
           <w:b/>
@@ -7218,12 +7373,8 @@
           <w:sz w:val="22"/>
           <w:szCs w:val="22"/>
         </w:rPr>
-        <w:t>Figure 2: Protected Endpoint Access</w:t>
-      </w:r>
-    </w:p>
-    <w:p>
-      <w:pPr>
-        <w:jc w:val="center"/>
+      </w:pPr>
+      <w:r>
         <w:rPr>
           <w:rFonts w:ascii="Arial" w:hAnsi="Arial" w:cs="Arial"/>
           <w:b/>
@@ -7231,7 +7382,8 @@
           <w:sz w:val="22"/>
           <w:szCs w:val="22"/>
         </w:rPr>
-      </w:pPr>
+        <w:t>Figure 2: Protected Endpoint Access</w:t>
+      </w:r>
     </w:p>
     <w:p>
       <w:pPr>
@@ -7257,25 +7409,14 @@
           <w:sz w:val="22"/>
           <w:szCs w:val="22"/>
         </w:rPr>
+        <w:lastRenderedPageBreak/>
         <w:t>Missing Token Scenario:</w:t>
       </w:r>
-    </w:p>
-    <w:p>
-      <w:pPr>
-        <w:jc w:val="both"/>
-        <w:rPr>
-          <w:rFonts w:ascii="Arial" w:hAnsi="Arial" w:cs="Arial"/>
-          <w:sz w:val="22"/>
-          <w:szCs w:val="22"/>
-        </w:rPr>
-      </w:pPr>
-      <w:r>
-        <w:rPr>
-          <w:rFonts w:ascii="Arial" w:hAnsi="Arial" w:cs="Arial"/>
+      <w:r>
+        <w:rPr>
           <w:b/>
           <w:bCs/>
-          <w:sz w:val="22"/>
-          <w:szCs w:val="22"/>
+          <w:noProof/>
         </w:rPr>
         <w:drawing>
           <wp:anchor distT="0" distB="0" distL="114300" distR="114300" simplePos="0" relativeHeight="251665408" behindDoc="0" locked="0" layoutInCell="1" allowOverlap="1" wp14:anchorId="46843B3A" wp14:editId="39F37339">
@@ -7327,6 +7468,16 @@
       <w:r>
         <w:rPr>
           <w:rFonts w:ascii="Arial" w:hAnsi="Arial" w:cs="Arial"/>
+          <w:b/>
+          <w:bCs/>
+          <w:sz w:val="22"/>
+          <w:szCs w:val="22"/>
+        </w:rPr>
+        <w:t xml:space="preserve"> </w:t>
+      </w:r>
+      <w:r>
+        <w:rPr>
+          <w:rFonts w:ascii="Arial" w:hAnsi="Arial" w:cs="Arial"/>
           <w:sz w:val="22"/>
           <w:szCs w:val="22"/>
         </w:rPr>
@@ -7373,39 +7524,16 @@
       </w:pPr>
       <w:r>
         <w:rPr>
-          <w:rFonts w:ascii="Arial" w:hAnsi="Arial" w:cs="Arial"/>
-          <w:b/>
-          <w:bCs/>
-          <w:sz w:val="22"/>
-          <w:szCs w:val="22"/>
-        </w:rPr>
-        <w:lastRenderedPageBreak/>
-        <w:t>Invalid Token Scenario (Optional and Recommended):</w:t>
-      </w:r>
-    </w:p>
-    <w:p>
-      <w:pPr>
-        <w:jc w:val="both"/>
-        <w:rPr>
-          <w:rFonts w:ascii="Arial" w:hAnsi="Arial" w:cs="Arial"/>
-          <w:sz w:val="22"/>
-          <w:szCs w:val="22"/>
-        </w:rPr>
-      </w:pPr>
-      <w:r>
-        <w:rPr>
-          <w:rFonts w:ascii="Arial" w:hAnsi="Arial" w:cs="Arial"/>
-          <w:sz w:val="22"/>
-          <w:szCs w:val="22"/>
+          <w:noProof/>
         </w:rPr>
         <w:drawing>
-          <wp:anchor distT="0" distB="0" distL="114300" distR="114300" simplePos="0" relativeHeight="251667456" behindDoc="0" locked="0" layoutInCell="1" allowOverlap="1" wp14:anchorId="4627F4F5" wp14:editId="14C90862">
+          <wp:anchor distT="0" distB="0" distL="114300" distR="114300" simplePos="0" relativeHeight="251667456" behindDoc="0" locked="0" layoutInCell="1" allowOverlap="1" wp14:anchorId="4627F4F5" wp14:editId="01508E0F">
             <wp:simplePos x="0" y="0"/>
             <wp:positionH relativeFrom="margin">
               <wp:align>left</wp:align>
             </wp:positionH>
             <wp:positionV relativeFrom="paragraph">
-              <wp:posOffset>636270</wp:posOffset>
+              <wp:posOffset>925830</wp:posOffset>
             </wp:positionV>
             <wp:extent cx="5731510" cy="3596005"/>
             <wp:effectExtent l="0" t="0" r="2540" b="4445"/>
@@ -7445,6 +7573,26 @@
       <w:r>
         <w:rPr>
           <w:rFonts w:ascii="Arial" w:hAnsi="Arial" w:cs="Arial"/>
+          <w:b/>
+          <w:bCs/>
+          <w:sz w:val="22"/>
+          <w:szCs w:val="22"/>
+        </w:rPr>
+        <w:t>Invalid Token Scenario (Optional and Recommended):</w:t>
+      </w:r>
+      <w:r>
+        <w:rPr>
+          <w:rFonts w:ascii="Arial" w:hAnsi="Arial" w:cs="Arial"/>
+          <w:b/>
+          <w:bCs/>
+          <w:sz w:val="22"/>
+          <w:szCs w:val="22"/>
+        </w:rPr>
+        <w:t xml:space="preserve"> </w:t>
+      </w:r>
+      <w:r>
+        <w:rPr>
+          <w:rFonts w:ascii="Arial" w:hAnsi="Arial" w:cs="Arial"/>
           <w:sz w:val="22"/>
           <w:szCs w:val="22"/>
         </w:rPr>
@@ -7524,6 +7672,7 @@
           <w:sz w:val="22"/>
           <w:szCs w:val="22"/>
         </w:rPr>
+        <w:lastRenderedPageBreak/>
         <w:t xml:space="preserve">IMPLEMENTATION ISSUES </w:t>
       </w:r>
     </w:p>
@@ -7889,7 +8038,6 @@
           <w:sz w:val="22"/>
           <w:szCs w:val="22"/>
         </w:rPr>
-        <w:lastRenderedPageBreak/>
         <w:t>Introduce Refresh Tokens:</w:t>
       </w:r>
       <w:r>
@@ -8289,6 +8437,7 @@
           <w:sz w:val="22"/>
           <w:szCs w:val="22"/>
         </w:rPr>
+        <w:lastRenderedPageBreak/>
         <w:t>No token test</w:t>
       </w:r>
     </w:p>
@@ -8628,7 +8777,6 @@
           <w:sz w:val="22"/>
           <w:szCs w:val="22"/>
         </w:rPr>
-        <w:lastRenderedPageBreak/>
         <w:t xml:space="preserve">       </w:t>
       </w:r>
       <w:r>
@@ -8771,6 +8919,14 @@
         </w:rPr>
         <w:t>The token can be re-used within its own lifespan</w:t>
       </w:r>
+      <w:r>
+        <w:rPr>
+          <w:rFonts w:ascii="Arial" w:hAnsi="Arial" w:cs="Arial"/>
+          <w:sz w:val="22"/>
+          <w:szCs w:val="22"/>
+        </w:rPr>
+        <w:t xml:space="preserve"> </w:t>
+      </w:r>
     </w:p>
     <w:p>
       <w:pPr>
@@ -8922,6 +9078,26 @@
         <w:jc w:val="both"/>
         <w:rPr>
           <w:rFonts w:ascii="Arial" w:hAnsi="Arial" w:cs="Arial"/>
+          <w:sz w:val="22"/>
+          <w:szCs w:val="22"/>
+        </w:rPr>
+      </w:pPr>
+    </w:p>
+    <w:p>
+      <w:pPr>
+        <w:jc w:val="both"/>
+        <w:rPr>
+          <w:rFonts w:ascii="Arial" w:hAnsi="Arial" w:cs="Arial"/>
+          <w:sz w:val="22"/>
+          <w:szCs w:val="22"/>
+        </w:rPr>
+      </w:pPr>
+    </w:p>
+    <w:p>
+      <w:pPr>
+        <w:jc w:val="both"/>
+        <w:rPr>
+          <w:rFonts w:ascii="Arial" w:hAnsi="Arial" w:cs="Arial"/>
           <w:b/>
           <w:bCs/>
           <w:sz w:val="22"/>
@@ -8936,6 +9112,7 @@
           <w:sz w:val="22"/>
           <w:szCs w:val="22"/>
         </w:rPr>
+        <w:lastRenderedPageBreak/>
         <w:t xml:space="preserve">        </w:t>
       </w:r>
       <w:r>
@@ -9225,7 +9402,6 @@
           <w:sz w:val="22"/>
           <w:szCs w:val="22"/>
         </w:rPr>
-        <w:lastRenderedPageBreak/>
         <w:t xml:space="preserve">Replay </w:t>
       </w:r>
       <w:r>
@@ -9365,23 +9541,7 @@
           <w:sz w:val="22"/>
           <w:szCs w:val="22"/>
         </w:rPr>
-        <w:t xml:space="preserve">A practical implementation was built in the form of a RESTful API using the Flask framework and demonstrated that a system could provide secure authentication and access control to its resources by the implementation of tokens. Token generation and validation were shown to be implemented </w:t>
-      </w:r>
-      <w:r>
-        <w:rPr>
-          <w:rFonts w:ascii="Arial" w:hAnsi="Arial" w:cs="Arial"/>
-          <w:sz w:val="22"/>
-          <w:szCs w:val="22"/>
-        </w:rPr>
-        <w:t>successfully,</w:t>
-      </w:r>
-      <w:r>
-        <w:rPr>
-          <w:rFonts w:ascii="Arial" w:hAnsi="Arial" w:cs="Arial"/>
-          <w:sz w:val="22"/>
-          <w:szCs w:val="22"/>
-        </w:rPr>
-        <w:t xml:space="preserve"> and authentication tests were performed which proved that the system was correctly authenticating, protecting resources and dealing with invalid and non-existent tokens.</w:t>
+        <w:t>A practical implementation was built in the form of a RESTful API using the Flask framework and demonstrated that a system could provide secure authentication and access control to its resources by the implementation of tokens. Token generation and validation were shown to be implemented successfully, and authentication tests were performed which proved that the system was correctly authenticating, protecting resources and dealing with invalid and non-existent tokens.</w:t>
       </w:r>
       <w:r>
         <w:rPr>
@@ -9397,39 +9557,7 @@
           <w:sz w:val="22"/>
           <w:szCs w:val="22"/>
         </w:rPr>
-        <w:t xml:space="preserve">Evaluation showed that the system provided advantages and limitations. These </w:t>
-      </w:r>
-      <w:r>
-        <w:rPr>
-          <w:rFonts w:ascii="Arial" w:hAnsi="Arial" w:cs="Arial"/>
-          <w:sz w:val="22"/>
-          <w:szCs w:val="22"/>
-        </w:rPr>
-        <w:t>included</w:t>
-      </w:r>
-      <w:r>
-        <w:rPr>
-          <w:rFonts w:ascii="Arial" w:hAnsi="Arial" w:cs="Arial"/>
-          <w:sz w:val="22"/>
-          <w:szCs w:val="22"/>
-        </w:rPr>
-        <w:t xml:space="preserve"> the advantages of </w:t>
-      </w:r>
-      <w:r>
-        <w:rPr>
-          <w:rFonts w:ascii="Arial" w:hAnsi="Arial" w:cs="Arial"/>
-          <w:sz w:val="22"/>
-          <w:szCs w:val="22"/>
-        </w:rPr>
-        <w:t>scalability</w:t>
-      </w:r>
-      <w:r>
-        <w:rPr>
-          <w:rFonts w:ascii="Arial" w:hAnsi="Arial" w:cs="Arial"/>
-          <w:sz w:val="22"/>
-          <w:szCs w:val="22"/>
-        </w:rPr>
-        <w:t>, efficiency and versatility that come with JWTs, contrasted with the requirement for care in implementation to protect against issues like token reuse and lack of a revocation system.</w:t>
+        <w:t>Evaluation showed that the system provided advantages and limitations. These included the advantages of scalability, efficiency and versatility that come with JWTs, contrasted with the requirement for care in implementation to protect against issues like token reuse and lack of a revocation system.</w:t>
       </w:r>
       <w:r>
         <w:rPr>
@@ -9445,24 +9573,28 @@
           <w:sz w:val="22"/>
           <w:szCs w:val="22"/>
         </w:rPr>
-        <w:t xml:space="preserve">In conclusion, it has been proven that the tokenization of authentication is a robust and general technique for modern systems. The project does, </w:t>
-      </w:r>
-      <w:r>
-        <w:rPr>
-          <w:rFonts w:ascii="Arial" w:hAnsi="Arial" w:cs="Arial"/>
-          <w:sz w:val="22"/>
-          <w:szCs w:val="22"/>
-        </w:rPr>
-        <w:t>however,</w:t>
-      </w:r>
-      <w:r>
-        <w:rPr>
-          <w:rFonts w:ascii="Arial" w:hAnsi="Arial" w:cs="Arial"/>
-          <w:sz w:val="22"/>
-          <w:szCs w:val="22"/>
-        </w:rPr>
-        <w:t xml:space="preserve"> illustrate that further security benefits need to be integrated into the system to make it suitable for a real-world scenario.</w:t>
-      </w:r>
+        <w:t>In conclusion, it has been proven that the tokenization of authentication is a robust and general technique for modern systems. The project does, however, illustrate that further security benefits need to be integrated into the system to make it suitable for a real-world scenario.</w:t>
+      </w:r>
+    </w:p>
+    <w:p>
+      <w:pPr>
+        <w:jc w:val="both"/>
+        <w:rPr>
+          <w:rFonts w:ascii="Arial" w:hAnsi="Arial" w:cs="Arial"/>
+          <w:sz w:val="22"/>
+          <w:szCs w:val="22"/>
+        </w:rPr>
+      </w:pPr>
+    </w:p>
+    <w:p>
+      <w:pPr>
+        <w:jc w:val="both"/>
+        <w:rPr>
+          <w:rFonts w:ascii="Arial" w:hAnsi="Arial" w:cs="Arial"/>
+          <w:sz w:val="22"/>
+          <w:szCs w:val="22"/>
+        </w:rPr>
+      </w:pPr>
     </w:p>
     <w:p>
       <w:pPr>
@@ -9521,55 +9653,7 @@
           <w:sz w:val="22"/>
           <w:szCs w:val="22"/>
         </w:rPr>
-        <w:t xml:space="preserve">The implemented system clearly shows the basic concept of tokenisation using JSON Web </w:t>
-      </w:r>
-      <w:r>
-        <w:rPr>
-          <w:rFonts w:ascii="Arial" w:hAnsi="Arial" w:cs="Arial"/>
-          <w:sz w:val="22"/>
-          <w:szCs w:val="22"/>
-        </w:rPr>
-        <w:t>Tokens,</w:t>
-      </w:r>
-      <w:r>
-        <w:rPr>
-          <w:rFonts w:ascii="Arial" w:hAnsi="Arial" w:cs="Arial"/>
-          <w:sz w:val="22"/>
-          <w:szCs w:val="22"/>
-        </w:rPr>
-        <w:t xml:space="preserve"> but it could be enhanced further on scalability, security and </w:t>
-      </w:r>
-      <w:r>
-        <w:rPr>
-          <w:rFonts w:ascii="Arial" w:hAnsi="Arial" w:cs="Arial"/>
-          <w:sz w:val="22"/>
-          <w:szCs w:val="22"/>
-        </w:rPr>
-        <w:t>into</w:t>
-      </w:r>
-      <w:r>
-        <w:rPr>
-          <w:rFonts w:ascii="Arial" w:hAnsi="Arial" w:cs="Arial"/>
-          <w:sz w:val="22"/>
-          <w:szCs w:val="22"/>
-        </w:rPr>
-        <w:t xml:space="preserve"> a </w:t>
-      </w:r>
-      <w:r>
-        <w:rPr>
-          <w:rFonts w:ascii="Arial" w:hAnsi="Arial" w:cs="Arial"/>
-          <w:sz w:val="22"/>
-          <w:szCs w:val="22"/>
-        </w:rPr>
-        <w:t>full-fledged</w:t>
-      </w:r>
-      <w:r>
-        <w:rPr>
-          <w:rFonts w:ascii="Arial" w:hAnsi="Arial" w:cs="Arial"/>
-          <w:sz w:val="22"/>
-          <w:szCs w:val="22"/>
-        </w:rPr>
-        <w:t xml:space="preserve"> authentication system.</w:t>
+        <w:t>The implemented system clearly shows the basic concept of tokenisation using JSON Web Tokens, but it could be enhanced further on scalability, security and into a full-fledged authentication system.</w:t>
       </w:r>
       <w:r>
         <w:rPr>
@@ -9633,39 +9717,7 @@
           <w:sz w:val="22"/>
           <w:szCs w:val="22"/>
         </w:rPr>
-        <w:t xml:space="preserve">A token revocation mechanism by keeping a record of blacklisted tokens would add to the security such that if a token </w:t>
-      </w:r>
-      <w:r>
-        <w:rPr>
-          <w:rFonts w:ascii="Arial" w:hAnsi="Arial" w:cs="Arial"/>
-          <w:sz w:val="22"/>
-          <w:szCs w:val="22"/>
-        </w:rPr>
-        <w:t>were</w:t>
-      </w:r>
-      <w:r>
-        <w:rPr>
-          <w:rFonts w:ascii="Arial" w:hAnsi="Arial" w:cs="Arial"/>
-          <w:sz w:val="22"/>
-          <w:szCs w:val="22"/>
-        </w:rPr>
-        <w:t xml:space="preserve"> misused, even if the token has not expired, the user will be </w:t>
-      </w:r>
-      <w:r>
-        <w:rPr>
-          <w:rFonts w:ascii="Arial" w:hAnsi="Arial" w:cs="Arial"/>
-          <w:sz w:val="22"/>
-          <w:szCs w:val="22"/>
-        </w:rPr>
-        <w:t>blocked,</w:t>
-      </w:r>
-      <w:r>
-        <w:rPr>
-          <w:rFonts w:ascii="Arial" w:hAnsi="Arial" w:cs="Arial"/>
-          <w:sz w:val="22"/>
-          <w:szCs w:val="22"/>
-        </w:rPr>
-        <w:t xml:space="preserve"> and the user should log in again.</w:t>
+        <w:t>A token revocation mechanism by keeping a record of blacklisted tokens would add to the security such that if a token were misused, even if the token has not expired, the user will be blocked, and the user should log in again.</w:t>
       </w:r>
       <w:r>
         <w:rPr>
@@ -9715,6 +9767,16 @@
         </w:rPr>
         <w:t xml:space="preserve"> can be further extended into a microservices approach, where an API gateway would handle authentication and token validation whereas the backend services rely solely on the tokens for authentication.</w:t>
       </w:r>
+    </w:p>
+    <w:p>
+      <w:pPr>
+        <w:jc w:val="both"/>
+        <w:rPr>
+          <w:rFonts w:ascii="Arial" w:hAnsi="Arial" w:cs="Arial"/>
+          <w:sz w:val="22"/>
+          <w:szCs w:val="22"/>
+        </w:rPr>
+      </w:pPr>
     </w:p>
     <w:p>
       <w:pPr>
@@ -9735,7 +9797,6 @@
           <w:sz w:val="22"/>
           <w:szCs w:val="22"/>
         </w:rPr>
-        <w:lastRenderedPageBreak/>
         <w:t xml:space="preserve">         </w:t>
       </w:r>
       <w:r>
@@ -10171,180 +10232,6 @@
           <w:rFonts w:ascii="Arial" w:hAnsi="Arial" w:cs="Arial"/>
           <w:b/>
           <w:bCs/>
-          <w:sz w:val="22"/>
-          <w:szCs w:val="22"/>
-        </w:rPr>
-      </w:pPr>
-    </w:p>
-    <w:p>
-      <w:pPr>
-        <w:jc w:val="both"/>
-        <w:rPr>
-          <w:rFonts w:ascii="Arial" w:hAnsi="Arial" w:cs="Arial"/>
-          <w:sz w:val="22"/>
-          <w:szCs w:val="22"/>
-        </w:rPr>
-      </w:pPr>
-    </w:p>
-    <w:p>
-      <w:pPr>
-        <w:jc w:val="both"/>
-        <w:rPr>
-          <w:rFonts w:ascii="Arial" w:hAnsi="Arial" w:cs="Arial"/>
-          <w:sz w:val="22"/>
-          <w:szCs w:val="22"/>
-        </w:rPr>
-      </w:pPr>
-    </w:p>
-    <w:p>
-      <w:pPr>
-        <w:jc w:val="both"/>
-        <w:rPr>
-          <w:rFonts w:ascii="Arial" w:hAnsi="Arial" w:cs="Arial"/>
-          <w:sz w:val="22"/>
-          <w:szCs w:val="22"/>
-        </w:rPr>
-      </w:pPr>
-    </w:p>
-    <w:p>
-      <w:pPr>
-        <w:jc w:val="both"/>
-        <w:rPr>
-          <w:rFonts w:ascii="Arial" w:hAnsi="Arial" w:cs="Arial"/>
-          <w:sz w:val="22"/>
-          <w:szCs w:val="22"/>
-        </w:rPr>
-      </w:pPr>
-    </w:p>
-    <w:p>
-      <w:pPr>
-        <w:jc w:val="both"/>
-        <w:rPr>
-          <w:rFonts w:ascii="Arial" w:hAnsi="Arial" w:cs="Arial"/>
-          <w:b/>
-          <w:bCs/>
-          <w:sz w:val="22"/>
-          <w:szCs w:val="22"/>
-        </w:rPr>
-      </w:pPr>
-      <w:r>
-        <w:rPr>
-          <w:rFonts w:ascii="Arial" w:hAnsi="Arial" w:cs="Arial"/>
-          <w:b/>
-          <w:bCs/>
-          <w:sz w:val="22"/>
-          <w:szCs w:val="22"/>
-        </w:rPr>
-        <w:t xml:space="preserve"> </w:t>
-      </w:r>
-    </w:p>
-    <w:p>
-      <w:pPr>
-        <w:jc w:val="both"/>
-        <w:rPr>
-          <w:rFonts w:ascii="Arial" w:hAnsi="Arial" w:cs="Arial"/>
-          <w:sz w:val="22"/>
-          <w:szCs w:val="22"/>
-        </w:rPr>
-      </w:pPr>
-    </w:p>
-    <w:p>
-      <w:pPr>
-        <w:jc w:val="both"/>
-        <w:rPr>
-          <w:rFonts w:ascii="Arial" w:hAnsi="Arial" w:cs="Arial"/>
-          <w:sz w:val="22"/>
-          <w:szCs w:val="22"/>
-        </w:rPr>
-      </w:pPr>
-    </w:p>
-    <w:p>
-      <w:pPr>
-        <w:jc w:val="both"/>
-        <w:rPr>
-          <w:rFonts w:ascii="Arial" w:hAnsi="Arial" w:cs="Arial"/>
-          <w:sz w:val="22"/>
-          <w:szCs w:val="22"/>
-        </w:rPr>
-      </w:pPr>
-    </w:p>
-    <w:p>
-      <w:pPr>
-        <w:jc w:val="both"/>
-        <w:rPr>
-          <w:rFonts w:ascii="Arial" w:hAnsi="Arial" w:cs="Arial"/>
-          <w:sz w:val="22"/>
-          <w:szCs w:val="22"/>
-        </w:rPr>
-      </w:pPr>
-    </w:p>
-    <w:p>
-      <w:pPr>
-        <w:jc w:val="both"/>
-        <w:rPr>
-          <w:rFonts w:ascii="Arial" w:hAnsi="Arial" w:cs="Arial"/>
-          <w:sz w:val="22"/>
-          <w:szCs w:val="22"/>
-        </w:rPr>
-      </w:pPr>
-    </w:p>
-    <w:p>
-      <w:pPr>
-        <w:jc w:val="both"/>
-        <w:rPr>
-          <w:rFonts w:ascii="Arial" w:hAnsi="Arial" w:cs="Arial"/>
-          <w:sz w:val="22"/>
-          <w:szCs w:val="22"/>
-        </w:rPr>
-      </w:pPr>
-    </w:p>
-    <w:p>
-      <w:pPr>
-        <w:jc w:val="both"/>
-        <w:rPr>
-          <w:rFonts w:ascii="Arial" w:hAnsi="Arial" w:cs="Arial"/>
-          <w:sz w:val="22"/>
-          <w:szCs w:val="22"/>
-        </w:rPr>
-      </w:pPr>
-    </w:p>
-    <w:p>
-      <w:pPr>
-        <w:jc w:val="both"/>
-        <w:rPr>
-          <w:rFonts w:ascii="Arial" w:hAnsi="Arial" w:cs="Arial"/>
-          <w:b/>
-          <w:bCs/>
-          <w:sz w:val="22"/>
-          <w:szCs w:val="22"/>
-        </w:rPr>
-      </w:pPr>
-    </w:p>
-    <w:p>
-      <w:pPr>
-        <w:jc w:val="both"/>
-        <w:rPr>
-          <w:rFonts w:ascii="Arial" w:hAnsi="Arial" w:cs="Arial"/>
-          <w:sz w:val="22"/>
-          <w:szCs w:val="22"/>
-        </w:rPr>
-      </w:pPr>
-    </w:p>
-    <w:p>
-      <w:pPr>
-        <w:jc w:val="both"/>
-        <w:rPr>
-          <w:rFonts w:ascii="Arial" w:hAnsi="Arial" w:cs="Arial"/>
-          <w:sz w:val="22"/>
-          <w:szCs w:val="22"/>
-        </w:rPr>
-      </w:pPr>
-    </w:p>
-    <w:p>
-      <w:pPr>
-        <w:jc w:val="right"/>
-        <w:rPr>
-          <w:rFonts w:ascii="Arial" w:hAnsi="Arial" w:cs="Arial"/>
           <w:sz w:val="22"/>
           <w:szCs w:val="22"/>
         </w:rPr>
@@ -14544,6 +14431,10 @@
 </file>
 
 <file path=customXml/item1.xml><?xml version="1.0" encoding="utf-8"?>
+<b:Sources xmlns:b="http://schemas.openxmlformats.org/officeDocument/2006/bibliography" xmlns="http://schemas.openxmlformats.org/officeDocument/2006/bibliography" SelectedStyle="\APASixthEditionOfficeOnline.xsl" StyleName="APA" Version="6"/>
+</file>
+
+<file path=customXml/item2.xml><?xml version="1.0" encoding="utf-8"?>
 <ct:contentTypeSchema xmlns:ct="http://schemas.microsoft.com/office/2006/metadata/contentType" xmlns:ma="http://schemas.microsoft.com/office/2006/metadata/properties/metaAttributes" ct:_="" ma:_="" ma:contentTypeName="Document" ma:contentTypeID="0x0101003CE5D6D67CCF344B82B56BB4E021282A" ma:contentTypeVersion="5" ma:contentTypeDescription="Create a new document." ma:contentTypeScope="" ma:versionID="bf14ac6613854c4a7c981bd040d9f720">
   <xsd:schema xmlns:xsd="http://www.w3.org/2001/XMLSchema" xmlns:xs="http://www.w3.org/2001/XMLSchema" xmlns:p="http://schemas.microsoft.com/office/2006/metadata/properties" xmlns:ns3="fac3075d-8620-4e15-8c13-7b8de3d8e910" targetNamespace="http://schemas.microsoft.com/office/2006/metadata/properties" ma:root="true" ma:fieldsID="875a8f82e57b865f65d42ad3202449bb" ns3:_="">
     <xsd:import namespace="fac3075d-8620-4e15-8c13-7b8de3d8e910"/>
@@ -14693,19 +14584,7 @@
 </ct:contentTypeSchema>
 </file>
 
-<file path=customXml/item2.xml><?xml version="1.0" encoding="utf-8"?>
-<b:Sources xmlns:b="http://schemas.openxmlformats.org/officeDocument/2006/bibliography" xmlns="http://schemas.openxmlformats.org/officeDocument/2006/bibliography" SelectedStyle="\APASixthEditionOfficeOnline.xsl" StyleName="APA" Version="6"/>
-</file>
-
 <file path=customXml/item3.xml><?xml version="1.0" encoding="utf-8"?>
-<p:properties xmlns:p="http://schemas.microsoft.com/office/2006/metadata/properties" xmlns:xsi="http://www.w3.org/2001/XMLSchema-instance" xmlns:pc="http://schemas.microsoft.com/office/infopath/2007/PartnerControls">
-  <documentManagement>
-    <_activity xmlns="fac3075d-8620-4e15-8c13-7b8de3d8e910" xsi:nil="true"/>
-  </documentManagement>
-</p:properties>
-</file>
-
-<file path=customXml/item4.xml><?xml version="1.0" encoding="utf-8"?>
 <?mso-contentType ?>
 <FormTemplates xmlns="http://schemas.microsoft.com/sharepoint/v3/contenttype/forms">
   <Display>DocumentLibraryForm</Display>
@@ -14714,7 +14593,23 @@
 </FormTemplates>
 </file>
 
+<file path=customXml/item4.xml><?xml version="1.0" encoding="utf-8"?>
+<p:properties xmlns:p="http://schemas.microsoft.com/office/2006/metadata/properties" xmlns:xsi="http://www.w3.org/2001/XMLSchema-instance" xmlns:pc="http://schemas.microsoft.com/office/infopath/2007/PartnerControls">
+  <documentManagement>
+    <_activity xmlns="fac3075d-8620-4e15-8c13-7b8de3d8e910" xsi:nil="true"/>
+  </documentManagement>
+</p:properties>
+</file>
+
 <file path=customXml/itemProps1.xml><?xml version="1.0" encoding="utf-8"?>
+<ds:datastoreItem xmlns:ds="http://schemas.openxmlformats.org/officeDocument/2006/customXml" ds:itemID="{B4413563-2611-4281-AD64-B56EADE949CA}">
+  <ds:schemaRefs>
+    <ds:schemaRef ds:uri="http://schemas.openxmlformats.org/officeDocument/2006/bibliography"/>
+  </ds:schemaRefs>
+</ds:datastoreItem>
+</file>
+
+<file path=customXml/itemProps2.xml><?xml version="1.0" encoding="utf-8"?>
 <ds:datastoreItem xmlns:ds="http://schemas.openxmlformats.org/officeDocument/2006/customXml" ds:itemID="{1716041B-5C7B-4A00-A1E8-62D79B3071B1}">
   <ds:schemaRefs>
     <ds:schemaRef ds:uri="http://schemas.microsoft.com/office/2006/metadata/contentType"/>
@@ -14732,15 +14627,15 @@
 </ds:datastoreItem>
 </file>
 
-<file path=customXml/itemProps2.xml><?xml version="1.0" encoding="utf-8"?>
-<ds:datastoreItem xmlns:ds="http://schemas.openxmlformats.org/officeDocument/2006/customXml" ds:itemID="{B4413563-2611-4281-AD64-B56EADE949CA}">
+<file path=customXml/itemProps3.xml><?xml version="1.0" encoding="utf-8"?>
+<ds:datastoreItem xmlns:ds="http://schemas.openxmlformats.org/officeDocument/2006/customXml" ds:itemID="{50B0CF9B-8D76-4C82-8F50-CFF0137BCCDC}">
   <ds:schemaRefs>
-    <ds:schemaRef ds:uri="http://schemas.openxmlformats.org/officeDocument/2006/bibliography"/>
+    <ds:schemaRef ds:uri="http://schemas.microsoft.com/sharepoint/v3/contenttype/forms"/>
   </ds:schemaRefs>
 </ds:datastoreItem>
 </file>
 
-<file path=customXml/itemProps3.xml><?xml version="1.0" encoding="utf-8"?>
+<file path=customXml/itemProps4.xml><?xml version="1.0" encoding="utf-8"?>
 <ds:datastoreItem xmlns:ds="http://schemas.openxmlformats.org/officeDocument/2006/customXml" ds:itemID="{A7256D9C-366E-409C-848C-B93DD42EC6CE}">
   <ds:schemaRefs>
     <ds:schemaRef ds:uri="http://schemas.microsoft.com/office/2006/metadata/properties"/>
@@ -14748,12 +14643,4 @@
     <ds:schemaRef ds:uri="fac3075d-8620-4e15-8c13-7b8de3d8e910"/>
   </ds:schemaRefs>
 </ds:datastoreItem>
-</file>
-
-<file path=customXml/itemProps4.xml><?xml version="1.0" encoding="utf-8"?>
-<ds:datastoreItem xmlns:ds="http://schemas.openxmlformats.org/officeDocument/2006/customXml" ds:itemID="{50B0CF9B-8D76-4C82-8F50-CFF0137BCCDC}">
-  <ds:schemaRefs>
-    <ds:schemaRef ds:uri="http://schemas.microsoft.com/sharepoint/v3/contenttype/forms"/>
-  </ds:schemaRefs>
-</ds:datastoreItem>
 </file>
</xml_diff>